<commit_message>
fix(t3): reparatii post-audit (T3-02) - C11 FILM R-V02.15, C09 registry, CHAT-CONTEXT C12
</commit_message>
<xml_diff>
--- a/c11/FILM-Excel-11-Comparatii.docx
+++ b/c11/FILM-Excel-11-Comparatii.docx
@@ -1525,7 +1525,7 @@
           <w:rFonts w:ascii="Calibri" w:hAnsi="Calibri"/>
           <w:sz w:val="20"/>
         </w:rPr>
-        <w:t>Confirmăm martorul: „Suma de control a măsurii: șapte milioane nouă sute optzeci și șase de mii nouăsprezece lei. Verific cine duce de fapt din această sumă."</w:t>
+        <w:t>Confirmăm martorul: „Suma de control a măsurii este verificată. Verific cine duce de fapt din acest total."</w:t>
       </w:r>
     </w:p>
     <w:p>
@@ -2080,7 +2080,7 @@
           <w:rFonts w:ascii="Calibri" w:hAnsi="Calibri"/>
           <w:sz w:val="20"/>
         </w:rPr>
-        <w:t>Verificăm că diferențele dintre poziții sunt reale și că suma contribuțiilor dă întregul. Suma rămâne 7.986.019 (valoare_neta conservată din C10).</w:t>
+        <w:t>Verificăm că diferențele dintre poziții sunt reale și că suma contribuțiilor dă întregul. Suma de control rămâne neschimbată (valoare_neta conservată din C10).</w:t>
       </w:r>
     </w:p>
     <w:p>
@@ -2156,7 +2156,7 @@
           <w:rFonts w:ascii="Calibri" w:hAnsi="Calibri"/>
           <w:sz w:val="20"/>
         </w:rPr>
-        <w:t>Cursor pe coloana Contribuție %. Suma coloanei: 100%. Suma valoare_neta: 7.986.019,38 lei. Egal cu martorul din C10. Confirmare.</w:t>
+        <w:t>Cursor pe coloana Contribuție %. Suma coloanei: 100%. Suma valoare_neta este egală cu martorul din C10. Confirmare.</w:t>
       </w:r>
     </w:p>
     <w:p>
@@ -2610,7 +2610,7 @@
           <w:rFonts w:ascii="Calibri" w:hAnsi="Calibri"/>
           <w:sz w:val="20"/>
         </w:rPr>
-        <w:t>Foaia Comparatii cu rang, contribuție și clasă ABC. Suma 7.986.019,38 lei verificată. Predat ca Date_MASTER-C11.xlsx (sheet Comparatii) către C12.</w:t>
+        <w:t>Foaia Comparatii cu rang, contribuție și clasă ABC. Suma de control verificată. Predat ca Date_MASTER-C11.xlsx (sheet Comparatii) către C12.</w:t>
       </w:r>
     </w:p>
     <w:p>
@@ -2660,7 +2660,7 @@
           <w:rFonts w:ascii="Calibri" w:hAnsi="Calibri"/>
           <w:sz w:val="20"/>
         </w:rPr>
-        <w:t>Rostim semnătura: „Nu am citit lista. Am citit ierarhia. Suma de control: șapte milioane nouă sute optzeci și șase de mii nouăsprezece lei."</w:t>
+        <w:t>Rostim semnătura: „Nu am citit lista. Am citit ierarhia. Suma de control rămâne verificată."</w:t>
       </w:r>
     </w:p>
     <w:p>

</xml_diff>